<commit_message>
updated pipeline, extension, archi
</commit_message>
<xml_diff>
--- a/DOCUMENTATION/THESIS CONTEXT ARCHITECTURE.docx
+++ b/DOCUMENTATION/THESIS CONTEXT ARCHITECTURE.docx
@@ -1375,7 +1375,7 @@
               </w:rPr>
             </w:pPr>
             <w:r>
-              <w:t>Either prediction</w:t>
+              <w:t>Reliable</w:t>
             </w:r>
           </w:p>
         </w:tc>
@@ -1405,7 +1405,57 @@
               </w:rPr>
             </w:pPr>
             <w:r>
-              <w:t>Insufficient evidence / requires caution</w:t>
+              <w:t>Not verified: model estimate is Reliable / use caution</w:t>
+            </w:r>
+          </w:p>
+        </w:tc>
+      </w:tr>
+      <w:tr>
+        <w:trPr>
+          <w:jc w:val="center"/>
+        </w:trPr>
+        <w:tc>
+          <w:tcPr>
+            <w:tcW w:w="3312" w:type="dxa"/>
+          </w:tcPr>
+          <w:p>
+            <w:pPr>
+              <w:rPr>
+                <w:rFonts w:hint="eastAsia"/>
+              </w:rPr>
+            </w:pPr>
+            <w:r>
+              <w:t>Misinformation</w:t>
+            </w:r>
+          </w:p>
+        </w:tc>
+        <w:tc>
+          <w:tcPr>
+            <w:tcW w:w="3312" w:type="dxa"/>
+          </w:tcPr>
+          <w:p>
+            <w:pPr>
+              <w:rPr>
+                <w:rFonts w:hint="eastAsia"/>
+              </w:rPr>
+            </w:pPr>
+            <w:r>
+              <w:t>Insufficient</w:t>
+            </w:r>
+          </w:p>
+        </w:tc>
+        <w:tc>
+          <w:tcPr>
+            <w:tcW w:w="3312" w:type="dxa"/>
+          </w:tcPr>
+          <w:p>
+            <w:pPr>
+              <w:rPr>
+                <w:rFonts w:hint="eastAsia"/>
+              </w:rPr>
+            </w:pPr>
+            <w:r>
+              <w:t>Not verified: model estimate is Misinformation / use caution</w:t>
             </w:r>
           </w:p>
         </w:tc>
@@ -2476,7 +2526,7 @@
         </w:rPr>
       </w:pPr>
       <w:r>
-        <w:t>The proposed contribution should not be framed simply as “a Chrome extension” or “the use of multiple ML models.” A stronger direction is the integration and evaluation of claim-level health misinformation detection, hybrid machine-learning classification, semantic evidence retrieval, evidence-aware verification, explainable disagreement handling, and controlled feedback-assisted model improvement directly within the browsing experience.</w:t>
+        <w:t>The proposed contribution should not be framed simply as “a Chrome extension” or “the use of multiple ML models.” The central contribution is a strong claim-level classifier for health misinformation that works on English and Tagalog/Taglish text, built as a hybrid of traditional and transformer models and evaluated on a held-out, leakage-free test set. Around that classifier, the system adds semantic evidence retrieval and evidence-aware verification, which act as a second check and expose the classifier's errors; explainable disagreement handling, so a conflict between the model and the evidence is shown instead of hidden; the model's estimate shown as unverified when no evidence is available; and controlled feedback-assisted model improvement, directly within the browsing experience.</w:t>
       </w:r>
     </w:p>
     <w:p>
@@ -2486,7 +2536,7 @@
         </w:rPr>
       </w:pPr>
       <w:r>
-        <w:t>A possible research question is: “Can an evidence-aware verification layer improve the reliability and usefulness of machine-learning-based health misinformation detection compared with classification alone?”</w:t>
+        <w:t>The research question is: “Can a claim-level, multilingual hybrid classifier reliably detect health misinformation in English and Tagalog, and can retrieved evidence help expose its errors?” The classifier is the primary object of evaluation (accuracy, macro-F1, and per-class recall); the evidence layer is evaluated as a supporting component, for example by how many classifier errors it flags as conflicts.</w:t>
       </w:r>
     </w:p>
     <w:p>
@@ -4542,6 +4592,608 @@
       </w:pPr>
       <w:r>
         <w:t>The system prioritizes user-selected text as the primary claim-acquisition mechanism to reduce webpage extraction complexity and provide precise claim-level input across different websites. An automatic scanning mode is also planned, in which webpage content is extracted, segmented, filtered for health relevance, and screened for verifiable claims before each detected claim is passed to the same misinformation classification and evidence verification pipeline.</w:t>
+      </w:r>
+    </w:p>
+    <w:p>
+      <w:pPr>
+        <w:pStyle w:val="Heading1"/>
+      </w:pPr>
+      <w:r>
+        <w:t>17. Language Scope and Technology Selection</w:t>
+      </w:r>
+    </w:p>
+    <w:p>
+      <w:pPr/>
+      <w:r>
+        <w:t>This section was added after the original architecture was agreed. It states the language scope, the proposed technologies for each pipeline stage, and the hardware limits for model training. Items marked OPEN require a decision or an experiment before they are final. The full working version is maintained in TECH_STACK.md.</w:t>
+      </w:r>
+    </w:p>
+    <w:p>
+      <w:pPr>
+        <w:pStyle w:val="Heading2"/>
+      </w:pPr>
+      <w:r>
+        <w:t>17.1 Language Scope</w:t>
+      </w:r>
+    </w:p>
+    <w:p>
+      <w:pPr/>
+      <w:r>
+        <w:t>The system handles English and Tagalog content, including mixed Tagalog-English (Taglish) text commonly found on social media. The primary approach is to use multilingual models so that Tagalog is processed directly, without a translation step.</w:t>
+      </w:r>
+    </w:p>
+    <w:p>
+      <w:pPr>
+        <w:pStyle w:val="Heading2"/>
+      </w:pPr>
+      <w:r>
+        <w:t>17.2 Optional Translation Stage</w:t>
+      </w:r>
+    </w:p>
+    <w:p>
+      <w:pPr/>
+      <w:r>
+        <w:t>A translation stage (Tagalog/Taglish to English) may be placed before health-domain detection. It is not the default, because machine translation can reverse negation and distort culturally specific health terms, and it introduces a second source of error that makes classifier errors harder to attribute. If used, the original text is always retained and shown to the user. Its value is to be tested by comparing accuracy on a manually labeled Tagalog test set with and without translation.</w:t>
+      </w:r>
+    </w:p>
+    <w:p>
+      <w:pPr/>
+      <w:r>
+        <w:t>Selected text → language tag → [optional: translate to English] → health-domain detection → verifiable-claim detection → claim extraction → ML classification and evidence retrieval → evidence verification → decision layer.</w:t>
+      </w:r>
+    </w:p>
+    <w:p>
+      <w:pPr>
+        <w:pStyle w:val="Heading2"/>
+      </w:pPr>
+      <w:r>
+        <w:t>17.3 Proposed Technology by Stage</w:t>
+      </w:r>
+    </w:p>
+    <w:tbl>
+      <w:tblPr>
+        <w:tblStyle w:val="TableGrid"/>
+        <w:tblW w:type="auto" w:w="0"/>
+        <w:tblLook w:firstColumn="1" w:firstRow="1" w:lastColumn="0" w:lastRow="0" w:noHBand="0" w:noVBand="1" w:val="04A0"/>
+      </w:tblPr>
+      <w:tblGrid>
+        <w:gridCol w:w="3312"/>
+        <w:gridCol w:w="3312"/>
+        <w:gridCol w:w="3312"/>
+      </w:tblGrid>
+      <w:tr>
+        <w:tc>
+          <w:tcPr>
+            <w:tcW w:type="dxa" w:w="3312"/>
+          </w:tcPr>
+          <w:p>
+            <w:r>
+              <w:rPr>
+                <w:b/>
+              </w:rPr>
+              <w:t>Stage</w:t>
+            </w:r>
+          </w:p>
+        </w:tc>
+        <w:tc>
+          <w:tcPr>
+            <w:tcW w:type="dxa" w:w="3312"/>
+          </w:tcPr>
+          <w:p>
+            <w:r>
+              <w:rPr>
+                <w:b/>
+              </w:rPr>
+              <w:t>Proposed technology</w:t>
+            </w:r>
+          </w:p>
+        </w:tc>
+        <w:tc>
+          <w:tcPr>
+            <w:tcW w:type="dxa" w:w="3312"/>
+          </w:tcPr>
+          <w:p>
+            <w:r>
+              <w:rPr>
+                <w:b/>
+              </w:rPr>
+              <w:t>Status</w:t>
+            </w:r>
+          </w:p>
+        </w:tc>
+      </w:tr>
+      <w:tr>
+        <w:tc>
+          <w:tcPr>
+            <w:tcW w:type="dxa" w:w="3312"/>
+          </w:tcPr>
+          <w:p>
+            <w:r>
+              <w:t>Browser interface</w:t>
+            </w:r>
+          </w:p>
+        </w:tc>
+        <w:tc>
+          <w:tcPr>
+            <w:tcW w:type="dxa" w:w="3312"/>
+          </w:tcPr>
+          <w:p>
+            <w:r>
+              <w:t>Chrome Extension (Manifest V3), JavaScript/TypeScript</w:t>
+            </w:r>
+          </w:p>
+        </w:tc>
+        <w:tc>
+          <w:tcPr>
+            <w:tcW w:type="dxa" w:w="3312"/>
+          </w:tcPr>
+          <w:p>
+            <w:r>
+              <w:t>Agreed (section 9)</w:t>
+            </w:r>
+          </w:p>
+        </w:tc>
+      </w:tr>
+      <w:tr>
+        <w:tc>
+          <w:tcPr>
+            <w:tcW w:type="dxa" w:w="3312"/>
+          </w:tcPr>
+          <w:p>
+            <w:r>
+              <w:t>Backend API</w:t>
+            </w:r>
+          </w:p>
+        </w:tc>
+        <w:tc>
+          <w:tcPr>
+            <w:tcW w:type="dxa" w:w="3312"/>
+          </w:tcPr>
+          <w:p>
+            <w:r>
+              <w:t>Python, FastAPI, uvicorn, pydantic</w:t>
+            </w:r>
+          </w:p>
+        </w:tc>
+        <w:tc>
+          <w:tcPr>
+            <w:tcW w:type="dxa" w:w="3312"/>
+          </w:tcPr>
+          <w:p>
+            <w:r>
+              <w:t>Agreed (section 9)</w:t>
+            </w:r>
+          </w:p>
+        </w:tc>
+      </w:tr>
+      <w:tr>
+        <w:tc>
+          <w:tcPr>
+            <w:tcW w:type="dxa" w:w="3312"/>
+          </w:tcPr>
+          <w:p>
+            <w:r>
+              <w:t>Storage</w:t>
+            </w:r>
+          </w:p>
+        </w:tc>
+        <w:tc>
+          <w:tcPr>
+            <w:tcW w:type="dxa" w:w="3312"/>
+          </w:tcPr>
+          <w:p>
+            <w:r>
+              <w:t>SQLite</w:t>
+            </w:r>
+          </w:p>
+        </w:tc>
+        <w:tc>
+          <w:tcPr>
+            <w:tcW w:type="dxa" w:w="3312"/>
+          </w:tcPr>
+          <w:p>
+            <w:r>
+              <w:t>Agreed (sections 5, 14.2)</w:t>
+            </w:r>
+          </w:p>
+        </w:tc>
+      </w:tr>
+      <w:tr>
+        <w:tc>
+          <w:tcPr>
+            <w:tcW w:type="dxa" w:w="3312"/>
+          </w:tcPr>
+          <w:p>
+            <w:r>
+              <w:t>Language tagging</w:t>
+            </w:r>
+          </w:p>
+        </w:tc>
+        <w:tc>
+          <w:tcPr>
+            <w:tcW w:type="dxa" w:w="3312"/>
+          </w:tcPr>
+          <w:p>
+            <w:r>
+              <w:t>Function-word heuristic; fastText language ID or langdetect as replacement</w:t>
+            </w:r>
+          </w:p>
+        </w:tc>
+        <w:tc>
+          <w:tcPr>
+            <w:tcW w:type="dxa" w:w="3312"/>
+          </w:tcPr>
+          <w:p>
+            <w:r>
+              <w:t>OPEN</w:t>
+            </w:r>
+          </w:p>
+        </w:tc>
+      </w:tr>
+      <w:tr>
+        <w:tc>
+          <w:tcPr>
+            <w:tcW w:type="dxa" w:w="3312"/>
+          </w:tcPr>
+          <w:p>
+            <w:r>
+              <w:t>Health-domain and verifiable-claim detection</w:t>
+            </w:r>
+          </w:p>
+        </w:tc>
+        <w:tc>
+          <w:tcPr>
+            <w:tcW w:type="dxa" w:w="3312"/>
+          </w:tcPr>
+          <w:p>
+            <w:r>
+              <w:t>Health lexicon plus a small classifier</w:t>
+            </w:r>
+          </w:p>
+        </w:tc>
+        <w:tc>
+          <w:tcPr>
+            <w:tcW w:type="dxa" w:w="3312"/>
+          </w:tcPr>
+          <w:p>
+            <w:r>
+              <w:t>OPEN</w:t>
+            </w:r>
+          </w:p>
+        </w:tc>
+      </w:tr>
+      <w:tr>
+        <w:tc>
+          <w:tcPr>
+            <w:tcW w:type="dxa" w:w="3312"/>
+          </w:tcPr>
+          <w:p>
+            <w:r>
+              <w:t>Traditional classifiers</w:t>
+            </w:r>
+          </w:p>
+        </w:tc>
+        <w:tc>
+          <w:tcPr>
+            <w:tcW w:type="dxa" w:w="3312"/>
+          </w:tcPr>
+          <w:p>
+            <w:r>
+              <w:t>Linear SVM and Multinomial Naive Bayes on TF-IDF features (scikit-learn)</w:t>
+            </w:r>
+          </w:p>
+        </w:tc>
+        <w:tc>
+          <w:tcPr>
+            <w:tcW w:type="dxa" w:w="3312"/>
+          </w:tcPr>
+          <w:p>
+            <w:r>
+              <w:t>Matches section 13.5</w:t>
+            </w:r>
+          </w:p>
+        </w:tc>
+      </w:tr>
+      <w:tr>
+        <w:tc>
+          <w:tcPr>
+            <w:tcW w:type="dxa" w:w="3312"/>
+          </w:tcPr>
+          <w:p>
+            <w:r>
+              <w:t>Transformer classifier</w:t>
+            </w:r>
+          </w:p>
+        </w:tc>
+        <w:tc>
+          <w:tcPr>
+            <w:tcW w:type="dxa" w:w="3312"/>
+          </w:tcPr>
+          <w:p>
+            <w:r>
+              <w:t>xlm-roberta-base (multilingual RoBERTa), Hugging Face Transformers, PyTorch</w:t>
+            </w:r>
+          </w:p>
+        </w:tc>
+        <w:tc>
+          <w:tcPr>
+            <w:tcW w:type="dxa" w:w="3312"/>
+          </w:tcPr>
+          <w:p>
+            <w:r>
+              <w:t>Refines section 13.5</w:t>
+            </w:r>
+          </w:p>
+        </w:tc>
+      </w:tr>
+      <w:tr>
+        <w:tc>
+          <w:tcPr>
+            <w:tcW w:type="dxa" w:w="3312"/>
+          </w:tcPr>
+          <w:p>
+            <w:r>
+              <w:t>Semantic embeddings</w:t>
+            </w:r>
+          </w:p>
+        </w:tc>
+        <w:tc>
+          <w:tcPr>
+            <w:tcW w:type="dxa" w:w="3312"/>
+          </w:tcPr>
+          <w:p>
+            <w:r>
+              <w:t>sentence-transformers: paraphrase-multilingual-MiniLM-L12-v2 (alternative: LaBSE)</w:t>
+            </w:r>
+          </w:p>
+        </w:tc>
+        <w:tc>
+          <w:tcPr>
+            <w:tcW w:type="dxa" w:w="3312"/>
+          </w:tcPr>
+          <w:p>
+            <w:r>
+              <w:t>Matches section 9</w:t>
+            </w:r>
+          </w:p>
+        </w:tc>
+      </w:tr>
+      <w:tr>
+        <w:tc>
+          <w:tcPr>
+            <w:tcW w:type="dxa" w:w="3312"/>
+          </w:tcPr>
+          <w:p>
+            <w:r>
+              <w:t>Vector search</w:t>
+            </w:r>
+          </w:p>
+        </w:tc>
+        <w:tc>
+          <w:tcPr>
+            <w:tcW w:type="dxa" w:w="3312"/>
+          </w:tcPr>
+          <w:p>
+            <w:r>
+              <w:t>Cosine similarity over a NumPy matrix; FAISS only if the evidence base grows large</w:t>
+            </w:r>
+          </w:p>
+        </w:tc>
+        <w:tc>
+          <w:tcPr>
+            <w:tcW w:type="dxa" w:w="3312"/>
+          </w:tcPr>
+          <w:p>
+            <w:r>
+              <w:t>Proposed</w:t>
+            </w:r>
+          </w:p>
+        </w:tc>
+      </w:tr>
+      <w:tr>
+        <w:tc>
+          <w:tcPr>
+            <w:tcW w:type="dxa" w:w="3312"/>
+          </w:tcPr>
+          <w:p>
+            <w:r>
+              <w:t>Evidence verification</w:t>
+            </w:r>
+          </w:p>
+        </w:tc>
+        <w:tc>
+          <w:tcPr>
+            <w:tcW w:type="dxa" w:w="3312"/>
+          </w:tcPr>
+          <w:p>
+            <w:r>
+              <w:t>Multilingual NLI cross-encoder (candidate: an mDeBERTa-v3 XNLI model) mapped to Supported / Contradicted / Insufficient Evidence</w:t>
+            </w:r>
+          </w:p>
+        </w:tc>
+        <w:tc>
+          <w:tcPr>
+            <w:tcW w:type="dxa" w:w="3312"/>
+          </w:tcPr>
+          <w:p>
+            <w:r>
+              <w:t>OPEN; method not specified in section 5</w:t>
+            </w:r>
+          </w:p>
+        </w:tc>
+      </w:tr>
+      <w:tr>
+        <w:tc>
+          <w:tcPr>
+            <w:tcW w:type="dxa" w:w="3312"/>
+          </w:tcPr>
+          <w:p>
+            <w:r>
+              <w:t>Translation (optional)</w:t>
+            </w:r>
+          </w:p>
+        </w:tc>
+        <w:tc>
+          <w:tcPr>
+            <w:tcW w:type="dxa" w:w="3312"/>
+          </w:tcPr>
+          <w:p>
+            <w:r>
+              <w:t>NLLB-200 distilled (about 600M parameters), license CC-BY-NC</w:t>
+            </w:r>
+          </w:p>
+        </w:tc>
+        <w:tc>
+          <w:tcPr>
+            <w:tcW w:type="dxa" w:w="3312"/>
+          </w:tcPr>
+          <w:p>
+            <w:r>
+              <w:t>OPEN; experiment only</w:t>
+            </w:r>
+          </w:p>
+        </w:tc>
+      </w:tr>
+      <w:tr>
+        <w:tc>
+          <w:tcPr>
+            <w:tcW w:type="dxa" w:w="3312"/>
+          </w:tcPr>
+          <w:p>
+            <w:r>
+              <w:t>Evaluation</w:t>
+            </w:r>
+          </w:p>
+        </w:tc>
+        <w:tc>
+          <w:tcPr>
+            <w:tcW w:type="dxa" w:w="3312"/>
+          </w:tcPr>
+          <w:p>
+            <w:r>
+              <w:t>Accuracy, precision, recall, F1, macro-F1, confusion matrix, per-class recall (scikit-learn)</w:t>
+            </w:r>
+          </w:p>
+        </w:tc>
+        <w:tc>
+          <w:tcPr>
+            <w:tcW w:type="dxa" w:w="3312"/>
+          </w:tcPr>
+          <w:p>
+            <w:r>
+              <w:t>Matches section 13.7</w:t>
+            </w:r>
+          </w:p>
+        </w:tc>
+      </w:tr>
+      <w:tr>
+        <w:tc>
+          <w:tcPr>
+            <w:tcW w:type="dxa" w:w="3312"/>
+          </w:tcPr>
+          <w:p>
+            <w:r>
+              <w:t>Model artifacts</w:t>
+            </w:r>
+          </w:p>
+        </w:tc>
+        <w:tc>
+          <w:tcPr>
+            <w:tcW w:type="dxa" w:w="3312"/>
+          </w:tcPr>
+          <w:p>
+            <w:r>
+              <w:t>One folder per version with model, tokenizer/vectorizer, label map, thresholds, dataset version, metrics; registered in model_versions</w:t>
+            </w:r>
+          </w:p>
+        </w:tc>
+        <w:tc>
+          <w:tcPr>
+            <w:tcW w:type="dxa" w:w="3312"/>
+          </w:tcPr>
+          <w:p>
+            <w:r>
+              <w:t>Matches section 13.8</w:t>
+            </w:r>
+          </w:p>
+        </w:tc>
+      </w:tr>
+    </w:tbl>
+    <w:p>
+      <w:pPr/>
+    </w:p>
+    <w:p>
+      <w:pPr/>
+      <w:r>
+        <w:t>Model licenses must be verified on each model card before being cited. The NLLB license is non-commercial.</w:t>
+      </w:r>
+    </w:p>
+    <w:p>
+      <w:pPr>
+        <w:pStyle w:val="Heading2"/>
+      </w:pPr>
+      <w:r>
+        <w:t>17.4 Hardware Constraints and Training Configuration</w:t>
+      </w:r>
+    </w:p>
+    <w:p>
+      <w:pPr/>
+      <w:r>
+        <w:t>Training and inference run on a laptop with an NVIDIA GeForce RTX 2050 (4 GB VRAM). This permits SVM and Naive Bayes training on CPU, embedding generation, and xlm-roberta-base inference. Fine-tuning xlm-roberta-base is possible but tight and requires mixed precision (fp16), a small batch size (about 8), a maximum sequence length of about 128 tokens, and gradient accumulation. Larger models (xlm-roberta-large, large translation models, large language models) are outside the hardware budget.</w:t>
+      </w:r>
+    </w:p>
+    <w:p>
+      <w:pPr/>
+      <w:r>
+        <w:t>All training runs must be reproducible: fixed random seeds, pinned library versions, and the configuration saved with each model version.</w:t>
+      </w:r>
+    </w:p>
+    <w:p>
+      <w:pPr>
+        <w:pStyle w:val="Heading2"/>
+      </w:pPr>
+      <w:r>
+        <w:t>17.5 Open Decisions</w:t>
+      </w:r>
+    </w:p>
+    <w:p>
+      <w:pPr>
+        <w:pStyle w:val="ListBullet"/>
+      </w:pPr>
+      <w:r>
+        <w:t>Whether the translation stage is implemented as part of the system or used only as an ablation experiment.</w:t>
+      </w:r>
+    </w:p>
+    <w:p>
+      <w:pPr>
+        <w:pStyle w:val="ListBullet"/>
+      </w:pPr>
+      <w:r>
+        <w:t>The NLI verifier model and its acceptance threshold; no relevant evidence or low confidence must return Insufficient Evidence.</w:t>
+      </w:r>
+    </w:p>
+    <w:p>
+      <w:pPr>
+        <w:pStyle w:val="ListBullet"/>
+      </w:pPr>
+      <w:r>
+        <w:t>The method for health-domain and verifiable-claim detection.</w:t>
+      </w:r>
+    </w:p>
+    <w:p>
+      <w:pPr>
+        <w:pStyle w:val="ListBullet"/>
+      </w:pPr>
+      <w:r>
+        <w:t>The language-identification method beyond the current heuristic.</w:t>
+      </w:r>
+    </w:p>
+    <w:p>
+      <w:pPr>
+        <w:pStyle w:val="ListBullet"/>
+      </w:pPr>
+      <w:r>
+        <w:t>A sufficiently large labeled dataset; the current seed set is too small and too imbalanced to train or evaluate the planned models.</w:t>
       </w:r>
     </w:p>
     <w:sectPr>

</xml_diff>